<commit_message>
fix: aggiorna link template sollecito tributi
</commit_message>
<xml_diff>
--- a/backend/app/modules/ruolo/templates/Avviso_Sollecito_Template.docx
+++ b/backend/app/modules/ruolo/templates/Avviso_Sollecito_Template.docx
@@ -5094,7 +5094,7 @@
           <ns0:sz ns0:val="15"/>
           <ns0:szCs ns0:val="15"/>
         </ns0:rPr>
-        <ns0:t>) con Deliberazione 17/2003, esecutivo con determina n. 1297/2004 del Dirigente del Servizio Strutture ed Infrastrutture della RAS, modificato con Delibera Commissariale 187/2006 (esecutiva con determina 54413-4611/2007) e Delibera Commissariale 92/2013 (esecutiva con determina 1822/VII.7.5/2014) pubblicata dal 27.12.2013 sul sito web:                    https://www.bonificaoristanese.it/servizi/amministrazione-trasparente/ provvedimenti/provvedimenti-organi-indirizzo-politico.</ns0:t>
+        <ns0:t>) con Deliberazione 17/2003, esecutivo con determina n. 1297/2004 del Dirigente del Servizio Strutture ed Infrastrutture della RAS, modificato con Delibera Commissariale 187/2006 (esecutiva con determina 54413-4611/2007) e Delibera Commissariale 92/2013 (esecutiva con determina 1822/VII.7.5/2014) pubblicata dal 27.12.2013 sul sito web:                    https://www.bonificaoristanese.it/amministrazione-trasparente/.</ns0:t>
       </ns0:r>
     </ns0:p>
     <ns0:p>
@@ -5927,7 +5927,7 @@
           <ns0:sz ns0:val="15"/>
           <ns0:szCs ns0:val="15"/>
         </ns0:rPr>
-        <ns0:t>modulistica reperibile nel sito web dell’Ente all’indirizzo https://www.bonificaoristanese.it/servizi/modulistica</ns0:t>
+        <ns0:t>modulistica reperibile nel sito web dell’Ente all’indirizzo https://www.bonificaoristanese.it/modulistica/tributi-catasto-consortile-domande-irrigazione/</ns0:t>
       </ns0:r>
       <ns0:r>
         <ns0:rPr>

</xml_diff>